<commit_message>
Modelos PCMD: visual sóbrio e padronizado, só o essencial
- Planilhas: colunas técnicas ocultas (continuam calculando), cabeçalhos
  curtos, um só estilo de título e cabeçalho, sem rótulos de papel, selos
  e cartões; cor apenas para ERRO e Pendente/Verificar.
- Cronograma: parâmetros, resumo mensal, gráfico e conferências, sem
  cartões repetidos; eixo do gráfico com meses abreviados.
- Início curto (abas, passos, emissão); Listas sem linhas vazias.
- Tabelas imprimem a partir do cabeçalho; larguras e alinhamentos ajustados.
- Manuais: título simples, sem caixa de aviso no corpo (fica no rodapé),
  um único estilo de destaque, escopo em parágrafo.
- Contrato: campo coluna_oculta; resumo do Cronograma atualizado.
- Testes: 276 verificações, 0 falhas.

Co-Authored-By: Claude Opus 5.5 (1M context) <noreply@anthropic.com>
Claude-Session: https://claude.ai/code/session_01PZV8Ro8AtxoYvWQB1mMbxJ
</commit_message>
<xml_diff>
--- a/entrega-templates/manuais/PCMD-W1-Manual-Gestao-Ativos-Exemplo.docx
+++ b/entrega-templates/manuais/PCMD-W1-Manual-Gestao-Ativos-Exemplo.docx
@@ -12,7 +12,7 @@
     </w:p>
     <w:p>
       <w:pPr>
-        <w:spacing w:before="120"/>
+        <w:spacing w:before="80" w:after="200"/>
       </w:pPr>
       <w:r>
         <w:rPr>
@@ -434,34 +434,14 @@
     </w:tbl>
     <w:p>
       <w:pPr>
-        <w:spacing w:after="40"/>
-      </w:pPr>
-    </w:p>
-    <w:p>
-      <w:pPr>
-        <w:pStyle w:val="DestaquePCMD"/>
-        <w:pBdr>
-          <w:left w:val="single" w:sz="24" w:space="8" w:color="B85C00"/>
-        </w:pBdr>
-        <w:shd w:val="clear" w:color="auto" w:fill="FFF4C2"/>
+        <w:spacing w:before="80"/>
       </w:pPr>
       <w:r>
         <w:rPr>
-          <w:b/>
-          <w:color w:val="B85C00"/>
+          <w:color w:val="8C96A0"/>
+          <w:sz w:val="16"/>
         </w:rPr>
-        <w:t xml:space="preserve">AVISO  </w:t>
-      </w:r>
-      <w:r>
-        <w:t>O material apoia a organização do PCM e não substitui a avaliação de profissional habilitado nem o texto oficial das normas. As periodicidades são base genérica e devem ser confirmadas com o manual do fabricante.</w:t>
-      </w:r>
-    </w:p>
-    <w:p>
-      <w:pPr>
-        <w:pStyle w:val="NotaPCMD"/>
-      </w:pPr>
-      <w:r>
-        <w:t>Aprovador: preencher somente após aprovação efetiva. Este modelo não registra nem presume aprovação. Modelo PCM Direto 1.0.0 (23/10/2026) · Thiago Oliveira Lima · pcmdireto@gmail.com · Licença MIT.</w:t>
+        <w:t>Modelo PCM Direto 1.0.0 · Thiago Oliveira Lima · pcmdireto@gmail.com · Licença MIT</w:t>
       </w:r>
     </w:p>
     <w:p>
@@ -483,108 +463,11 @@
         <w:t xml:space="preserve"> cadastra, identifica, classifica e mantém o histórico dos seus ativos de manutenção, com os registros do PCM Direto e os modelos PCMD.</w:t>
       </w:r>
     </w:p>
-    <w:tbl>
-      <w:tblPr>
-        <w:tblStyle w:val="TableGrid"/>
-        <w:tblW w:type="auto" w:w="0"/>
-        <w:jc w:val="center"/>
-        <w:tblLayout w:type="fixed"/>
-        <w:tblLook w:firstColumn="1" w:firstRow="1" w:lastColumn="0" w:lastRow="0" w:noHBand="0" w:noVBand="1" w:val="04A0"/>
-        <w:tblLayout w:type="fixed"/>
-        <w:tblBorders>
-          <w:top w:val="single" w:sz="8" w:space="0" w:color="0B3D63"/>
-          <w:left w:val="nil"/>
-          <w:bottom w:val="single" w:sz="8" w:space="0" w:color="0B3D63"/>
-          <w:right w:val="nil"/>
-          <w:insideH w:val="single" w:sz="4" w:space="0" w:color="D5DDE5"/>
-          <w:insideV w:val="nil"/>
-        </w:tblBorders>
-        <w:tblCellMar>
-          <w:top w:w="45" w:type="dxa"/>
-          <w:bottom w:w="45" w:type="dxa"/>
-          <w:left w:w="85" w:type="dxa"/>
-          <w:right w:w="85" w:type="dxa"/>
-        </w:tblCellMar>
-      </w:tblPr>
-      <w:tblGrid>
-        <w:gridCol w:w="4819"/>
-        <w:gridCol w:w="4819"/>
-      </w:tblGrid>
-      <w:tr>
-        <w:trPr>
-          <w:tblHeader w:val="true"/>
-          <w:cantSplit/>
-        </w:trPr>
-        <w:tc>
-          <w:tcPr>
-            <w:tcW w:type="dxa" w:w="4819"/>
-            <w:shd w:val="clear" w:color="auto" w:fill="0B3D63"/>
-          </w:tcPr>
-          <w:p>
-            <w:pPr>
-              <w:pStyle w:val="TabelaPCMD"/>
-            </w:pPr>
-            <w:r>
-              <w:rPr>
-                <w:b/>
-                <w:color w:val="FFFFFF"/>
-              </w:rPr>
-              <w:t>Dentro do escopo</w:t>
-            </w:r>
-          </w:p>
-        </w:tc>
-        <w:tc>
-          <w:tcPr>
-            <w:tcW w:type="dxa" w:w="4819"/>
-            <w:shd w:val="clear" w:color="auto" w:fill="0B3D63"/>
-          </w:tcPr>
-          <w:p>
-            <w:pPr>
-              <w:pStyle w:val="TabelaPCMD"/>
-            </w:pPr>
-            <w:r>
-              <w:rPr>
-                <w:b/>
-                <w:color w:val="FFFFFF"/>
-              </w:rPr>
-              <w:t>Fora do escopo</w:t>
-            </w:r>
-          </w:p>
-        </w:tc>
-      </w:tr>
-      <w:tr>
-        <w:trPr>
-          <w:cantSplit/>
-        </w:trPr>
-        <w:tc>
-          <w:tcPr>
-            <w:tcW w:type="dxa" w:w="4819"/>
-          </w:tcPr>
-          <w:p>
-            <w:pPr>
-              <w:pStyle w:val="TabelaPCMD"/>
-            </w:pPr>
-            <w:r>
-              <w:t>Cadastro e hierarquia, IDs e TAGs, setores, criticidade, responsáveis, histórico, requisitos e controle documental.</w:t>
-            </w:r>
-          </w:p>
-        </w:tc>
-        <w:tc>
-          <w:tcPr>
-            <w:tcW w:type="dxa" w:w="4819"/>
-          </w:tcPr>
-          <w:p>
-            <w:pPr>
-              <w:pStyle w:val="TabelaPCMD"/>
-            </w:pPr>
-            <w:r>
-              <w:t>Procedimentos de execução, indicadores sem regra aprovada e qualquer declaração de conformidade legal.</w:t>
-            </w:r>
-          </w:p>
-        </w:tc>
-      </w:tr>
-    </w:tbl>
-    <w:p/>
+    <w:p>
+      <w:r>
+        <w:t>Inclui cadastro e hierarquia, IDs e TAGs, setores, criticidade, responsáveis, histórico, requisitos e controle documental. Não inclui procedimentos de execução, indicadores sem regra aprovada nem declaração de conformidade legal.</w:t>
+      </w:r>
+    </w:p>
     <w:p>
       <w:pPr>
         <w:pStyle w:val="Heading1"/>
@@ -2646,17 +2529,10 @@
       <w:pPr>
         <w:pStyle w:val="DestaquePCMD"/>
         <w:pBdr>
-          <w:left w:val="single" w:sz="24" w:space="8" w:color="7A0019"/>
+          <w:left w:val="single" w:sz="18" w:space="8" w:color="0B3D63"/>
         </w:pBdr>
-        <w:shd w:val="clear" w:color="auto" w:fill="FBE7EA"/>
+        <w:shd w:val="clear" w:color="auto" w:fill="F4F7FA"/>
       </w:pPr>
-      <w:r>
-        <w:rPr>
-          <w:b/>
-          <w:color w:val="7A0019"/>
-        </w:rPr>
-        <w:t xml:space="preserve">IMPORTANTE  </w:t>
-      </w:r>
       <w:r>
         <w:t>A classe não altera frequências, tarefas nem proteções de segurança. Mudanças no plano são decisão registrada do profissional responsável.</w:t>
       </w:r>
@@ -2942,17 +2818,10 @@
       <w:pPr>
         <w:pStyle w:val="DestaquePCMD"/>
         <w:pBdr>
-          <w:left w:val="single" w:sz="24" w:space="8" w:color="0B3D63"/>
+          <w:left w:val="single" w:sz="18" w:space="8" w:color="0B3D63"/>
         </w:pBdr>
         <w:shd w:val="clear" w:color="auto" w:fill="F4F7FA"/>
       </w:pPr>
-      <w:r>
-        <w:rPr>
-          <w:b/>
-          <w:color w:val="0B3D63"/>
-        </w:rPr>
-        <w:t xml:space="preserve">REGRA  </w:t>
-      </w:r>
       <w:r>
         <w:t>Cada referência começa Não verificado. Verificado exige fonte oficial HTTPS, versão e data; registra a conferência do responsável e não certifica conformidade. Não cite número de norma sem essas informações.</w:t>
       </w:r>
@@ -3509,17 +3378,10 @@
       <w:pPr>
         <w:pStyle w:val="DestaquePCMD"/>
         <w:pBdr>
-          <w:left w:val="single" w:sz="24" w:space="8" w:color="0B3D63"/>
+          <w:left w:val="single" w:sz="18" w:space="8" w:color="0B3D63"/>
         </w:pBdr>
         <w:shd w:val="clear" w:color="auto" w:fill="F4F7FA"/>
       </w:pPr>
-      <w:r>
-        <w:rPr>
-          <w:b/>
-          <w:color w:val="0B3D63"/>
-        </w:rPr>
-        <w:t xml:space="preserve">CATÁLOGO  </w:t>
-      </w:r>
       <w:r>
         <w:t>Ao usar um modelo do catálogo colaborativo, cria-se um ativo local; não há sincronização automática. Pessoas, organização, falhas e execuções são locais e não devem ser publicadas. Este manual e as planilhas não consultam a internet nem enviam dados.</w:t>
       </w:r>
@@ -5817,7 +5679,7 @@
       <w:spacing w:before="280" w:after="80"/>
       <w:outlineLvl w:val="0"/>
       <w:pBdr>
-        <w:bottom w:val="single" w:sz="8" w:space="3" w:color="B85C00"/>
+        <w:bottom w:val="single" w:sz="6" w:space="3" w:color="D5DDE5"/>
       </w:pBdr>
     </w:pPr>
     <w:rPr>
@@ -5848,7 +5710,7 @@
       <w:rFonts w:ascii="Arial" w:hAnsi="Arial" w:cs="Arial" w:eastAsia="Arial"/>
       <w:b/>
       <w:bCs/>
-      <w:color w:val="B85C00"/>
+      <w:color w:val="0B3D63"/>
       <w:sz w:val="22"/>
       <w:szCs w:val="26"/>
     </w:rPr>
@@ -6107,22 +5969,18 @@
       <w:keepNext/>
       <w:pBdr>
         <w:bottom w:val="single" w:sz="8" w:space="4" w:color="4F81BD" w:themeColor="accent1"/>
-        <w:top w:val="single" w:sz="24" w:space="10" w:color="0B3D63"/>
-        <w:left w:val="single" w:sz="24" w:space="10" w:color="0B3D63"/>
-        <w:bottom w:val="single" w:sz="24" w:space="10" w:color="0B3D63"/>
-        <w:right w:val="single" w:sz="24" w:space="10" w:color="0B3D63"/>
+        <w:bottom w:val="single" w:sz="12" w:space="4" w:color="0B3D63"/>
       </w:pBdr>
-      <w:spacing w:after="0" w:line="240" w:lineRule="auto" w:before="160"/>
+      <w:spacing w:after="40" w:line="240" w:lineRule="auto" w:before="160"/>
       <w:contextualSpacing/>
-      <w:shd w:val="clear" w:color="auto" w:fill="0B3D63"/>
     </w:pPr>
     <w:rPr>
       <w:rFonts w:ascii="Arial" w:hAnsi="Arial" w:cs="Arial" w:eastAsia="Arial"/>
       <w:b/>
-      <w:color w:val="FFFFFF"/>
+      <w:color w:val="0B3D63"/>
       <w:spacing w:val="5"/>
       <w:kern w:val="28"/>
-      <w:sz w:val="44"/>
+      <w:sz w:val="40"/>
       <w:szCs w:val="52"/>
     </w:rPr>
   </w:style>

</xml_diff>

<commit_message>
Cabeçalho simétrico, título simples e sem linha de aviso nas abas
- Retira a linha de aviso da área das planilhas; o aviso segue no rodapé impresso.
- Título do cabeçalho em texto simples (sem o código colado; o código fica no
  cabeçalho da página), com corpo ajustado à largura.
- Bloco da revisão com largura próxima à do logo (padrão 3 | 6 | 3 do modelo),
  inclusive na parte "(continuação)"; Elaborado e Aprovado em duas linhas.
- Manuais: título sem a linha do código. Testes: 276 verificações, 0 falhas.

Co-Authored-By: Claude Opus 5.5 (1M context) <noreply@anthropic.com>
Claude-Session: https://claude.ai/code/session_01PZV8Ro8AtxoYvWQB1mMbxJ
</commit_message>
<xml_diff>
--- a/entrega-templates/manuais/PCMD-W1-Manual-Gestao-Ativos-Exemplo.docx
+++ b/entrega-templates/manuais/PCMD-W1-Manual-Gestao-Ativos-Exemplo.docx
@@ -5275,20 +5275,6 @@
             <w:t>MANUAL DE GESTÃO DE ATIVOS</w:t>
           </w:r>
         </w:p>
-        <w:p>
-          <w:pPr>
-            <w:spacing w:after="0" w:line="240" w:lineRule="auto"/>
-            <w:jc w:val="center"/>
-          </w:pPr>
-          <w:r>
-            <w:rPr>
-              <w:b/>
-              <w:color w:val="B85C00"/>
-              <w:sz w:val="17"/>
-            </w:rPr>
-            <w:t>PCMD-W1</w:t>
-          </w:r>
-        </w:p>
       </w:tc>
       <w:tc>
         <w:tcPr>

</xml_diff>